<commit_message>
Add helm tutorial day 1
</commit_message>
<xml_diff>
--- a/14. GitOps/Guestbook app/Walkthrough.docx
+++ b/14. GitOps/Guestbook app/Walkthrough.docx
@@ -24,8 +24,6 @@
       </w:hyperlink>
     </w:p>
     <w:p>
-      <w:bookmarkStart w:id="0" w:name="_GoBack"/>
-      <w:bookmarkEnd w:id="0"/>
       <w:r>
         <w:t xml:space="preserve">Visit getting started with </w:t>
       </w:r>
@@ -1639,7 +1637,6 @@
         </w:r>
       </w:hyperlink>
     </w:p>
-    <w:p/>
     <w:p>
       <w:r>
         <w:t xml:space="preserve">To create an app: </w:t>
@@ -1652,6 +1649,393 @@
           <w:t>https://argo-cd.readthedocs.io/en/latest/user-guide/commands/argocd_app_create/</w:t>
         </w:r>
       </w:hyperlink>
+    </w:p>
+    <w:p>
+      <w:r>
+        <w:t xml:space="preserve">Login to </w:t>
+      </w:r>
+      <w:proofErr w:type="spellStart"/>
+      <w:r>
+        <w:t>argocd</w:t>
+      </w:r>
+      <w:proofErr w:type="spellEnd"/>
+      <w:r>
+        <w:t xml:space="preserve"> via CLI:</w:t>
+      </w:r>
+    </w:p>
+    <w:p>
+      <w:pPr>
+        <w:pStyle w:val="ListParagraph"/>
+        <w:numPr>
+          <w:ilvl w:val="0"/>
+          <w:numId w:val="1"/>
+        </w:numPr>
+      </w:pPr>
+      <w:proofErr w:type="spellStart"/>
+      <w:r>
+        <w:t>argocd</w:t>
+      </w:r>
+      <w:proofErr w:type="spellEnd"/>
+      <w:r>
+        <w:t xml:space="preserve"> login localhost:8080 --username admin --password o2CCBhMj1yFnFMl</w:t>
+      </w:r>
+    </w:p>
+    <w:p>
+      <w:r>
+        <w:drawing>
+          <wp:inline distT="0" distB="0" distL="0" distR="0" wp14:anchorId="63A2BC86" wp14:editId="1A18ED11">
+            <wp:extent cx="5731510" cy="525145"/>
+            <wp:effectExtent l="0" t="0" r="2540" b="8255"/>
+            <wp:docPr id="18" name="Picture 18"/>
+            <wp:cNvGraphicFramePr>
+              <a:graphicFrameLocks xmlns:a="http://schemas.openxmlformats.org/drawingml/2006/main" noChangeAspect="1"/>
+            </wp:cNvGraphicFramePr>
+            <a:graphic xmlns:a="http://schemas.openxmlformats.org/drawingml/2006/main">
+              <a:graphicData uri="http://schemas.openxmlformats.org/drawingml/2006/picture">
+                <pic:pic xmlns:pic="http://schemas.openxmlformats.org/drawingml/2006/picture">
+                  <pic:nvPicPr>
+                    <pic:cNvPr id="1" name=""/>
+                    <pic:cNvPicPr/>
+                  </pic:nvPicPr>
+                  <pic:blipFill>
+                    <a:blip r:embed="rId39"/>
+                    <a:stretch>
+                      <a:fillRect/>
+                    </a:stretch>
+                  </pic:blipFill>
+                  <pic:spPr>
+                    <a:xfrm>
+                      <a:off x="0" y="0"/>
+                      <a:ext cx="5731510" cy="525145"/>
+                    </a:xfrm>
+                    <a:prstGeom prst="rect">
+                      <a:avLst/>
+                    </a:prstGeom>
+                  </pic:spPr>
+                </pic:pic>
+              </a:graphicData>
+            </a:graphic>
+          </wp:inline>
+        </w:drawing>
+      </w:r>
+    </w:p>
+    <w:p>
+      <w:r>
+        <w:t>Create an application:</w:t>
+      </w:r>
+    </w:p>
+    <w:p>
+      <w:pPr>
+        <w:pStyle w:val="ListParagraph"/>
+        <w:numPr>
+          <w:ilvl w:val="0"/>
+          <w:numId w:val="1"/>
+        </w:numPr>
+      </w:pPr>
+      <w:proofErr w:type="spellStart"/>
+      <w:r>
+        <w:t>argocd</w:t>
+      </w:r>
+      <w:proofErr w:type="spellEnd"/>
+      <w:r>
+        <w:t xml:space="preserve"> app create </w:t>
+      </w:r>
+      <w:proofErr w:type="spellStart"/>
+      <w:r>
+        <w:t>faraz</w:t>
+      </w:r>
+      <w:proofErr w:type="spellEnd"/>
+      <w:r>
+        <w:t>-guestbook-via-cli --repo https://github.com/argoproj/argocd-example-apps.git --path guestbook --</w:t>
+      </w:r>
+      <w:proofErr w:type="spellStart"/>
+      <w:r>
+        <w:t>dest</w:t>
+      </w:r>
+      <w:proofErr w:type="spellEnd"/>
+      <w:r>
+        <w:t>-namespace default --</w:t>
+      </w:r>
+      <w:proofErr w:type="spellStart"/>
+      <w:r>
+        <w:t>dest</w:t>
+      </w:r>
+      <w:proofErr w:type="spellEnd"/>
+      <w:r>
+        <w:t>-server https://kubernetes.default.svc --directory-recurse</w:t>
+      </w:r>
+    </w:p>
+    <w:p>
+      <w:r>
+        <w:drawing>
+          <wp:inline distT="0" distB="0" distL="0" distR="0" wp14:anchorId="653A202E" wp14:editId="0C4BABB6">
+            <wp:extent cx="5731510" cy="271780"/>
+            <wp:effectExtent l="0" t="0" r="2540" b="0"/>
+            <wp:docPr id="19" name="Picture 19"/>
+            <wp:cNvGraphicFramePr>
+              <a:graphicFrameLocks xmlns:a="http://schemas.openxmlformats.org/drawingml/2006/main" noChangeAspect="1"/>
+            </wp:cNvGraphicFramePr>
+            <a:graphic xmlns:a="http://schemas.openxmlformats.org/drawingml/2006/main">
+              <a:graphicData uri="http://schemas.openxmlformats.org/drawingml/2006/picture">
+                <pic:pic xmlns:pic="http://schemas.openxmlformats.org/drawingml/2006/picture">
+                  <pic:nvPicPr>
+                    <pic:cNvPr id="1" name=""/>
+                    <pic:cNvPicPr/>
+                  </pic:nvPicPr>
+                  <pic:blipFill>
+                    <a:blip r:embed="rId40"/>
+                    <a:stretch>
+                      <a:fillRect/>
+                    </a:stretch>
+                  </pic:blipFill>
+                  <pic:spPr>
+                    <a:xfrm>
+                      <a:off x="0" y="0"/>
+                      <a:ext cx="5731510" cy="271780"/>
+                    </a:xfrm>
+                    <a:prstGeom prst="rect">
+                      <a:avLst/>
+                    </a:prstGeom>
+                  </pic:spPr>
+                </pic:pic>
+              </a:graphicData>
+            </a:graphic>
+          </wp:inline>
+        </w:drawing>
+      </w:r>
+    </w:p>
+    <w:p>
+      <w:r>
+        <w:t>Verify your app creation:</w:t>
+      </w:r>
+    </w:p>
+    <w:p>
+      <w:r>
+        <w:drawing>
+          <wp:inline distT="0" distB="0" distL="0" distR="0" wp14:anchorId="6572815D" wp14:editId="25BD8D93">
+            <wp:extent cx="5731510" cy="454025"/>
+            <wp:effectExtent l="0" t="0" r="2540" b="3175"/>
+            <wp:docPr id="21" name="Picture 21"/>
+            <wp:cNvGraphicFramePr>
+              <a:graphicFrameLocks xmlns:a="http://schemas.openxmlformats.org/drawingml/2006/main" noChangeAspect="1"/>
+            </wp:cNvGraphicFramePr>
+            <a:graphic xmlns:a="http://schemas.openxmlformats.org/drawingml/2006/main">
+              <a:graphicData uri="http://schemas.openxmlformats.org/drawingml/2006/picture">
+                <pic:pic xmlns:pic="http://schemas.openxmlformats.org/drawingml/2006/picture">
+                  <pic:nvPicPr>
+                    <pic:cNvPr id="1" name=""/>
+                    <pic:cNvPicPr/>
+                  </pic:nvPicPr>
+                  <pic:blipFill>
+                    <a:blip r:embed="rId41"/>
+                    <a:stretch>
+                      <a:fillRect/>
+                    </a:stretch>
+                  </pic:blipFill>
+                  <pic:spPr>
+                    <a:xfrm>
+                      <a:off x="0" y="0"/>
+                      <a:ext cx="5731510" cy="454025"/>
+                    </a:xfrm>
+                    <a:prstGeom prst="rect">
+                      <a:avLst/>
+                    </a:prstGeom>
+                  </pic:spPr>
+                </pic:pic>
+              </a:graphicData>
+            </a:graphic>
+          </wp:inline>
+        </w:drawing>
+      </w:r>
+    </w:p>
+    <w:p>
+      <w:r>
+        <w:drawing>
+          <wp:inline distT="0" distB="0" distL="0" distR="0" wp14:anchorId="35675DDD" wp14:editId="315B6B75">
+            <wp:extent cx="5731510" cy="1658620"/>
+            <wp:effectExtent l="0" t="0" r="2540" b="0"/>
+            <wp:docPr id="20" name="Picture 20"/>
+            <wp:cNvGraphicFramePr>
+              <a:graphicFrameLocks xmlns:a="http://schemas.openxmlformats.org/drawingml/2006/main" noChangeAspect="1"/>
+            </wp:cNvGraphicFramePr>
+            <a:graphic xmlns:a="http://schemas.openxmlformats.org/drawingml/2006/main">
+              <a:graphicData uri="http://schemas.openxmlformats.org/drawingml/2006/picture">
+                <pic:pic xmlns:pic="http://schemas.openxmlformats.org/drawingml/2006/picture">
+                  <pic:nvPicPr>
+                    <pic:cNvPr id="1" name=""/>
+                    <pic:cNvPicPr/>
+                  </pic:nvPicPr>
+                  <pic:blipFill>
+                    <a:blip r:embed="rId42"/>
+                    <a:stretch>
+                      <a:fillRect/>
+                    </a:stretch>
+                  </pic:blipFill>
+                  <pic:spPr>
+                    <a:xfrm>
+                      <a:off x="0" y="0"/>
+                      <a:ext cx="5731510" cy="1658620"/>
+                    </a:xfrm>
+                    <a:prstGeom prst="rect">
+                      <a:avLst/>
+                    </a:prstGeom>
+                  </pic:spPr>
+                </pic:pic>
+              </a:graphicData>
+            </a:graphic>
+          </wp:inline>
+        </w:drawing>
+      </w:r>
+    </w:p>
+    <w:p>
+      <w:pPr>
+        <w:numPr>
+          <w:ilvl w:val="0"/>
+          <w:numId w:val="3"/>
+        </w:numPr>
+      </w:pPr>
+      <w:r>
+        <w:t>The --</w:t>
+      </w:r>
+      <w:proofErr w:type="spellStart"/>
+      <w:r>
+        <w:t>dest</w:t>
+      </w:r>
+      <w:proofErr w:type="spellEnd"/>
+      <w:r>
+        <w:t xml:space="preserve">-namespace default flag tells Argo CD </w:t>
+      </w:r>
+      <w:r>
+        <w:rPr>
+          <w:b/>
+          <w:bCs/>
+        </w:rPr>
+        <w:t>where</w:t>
+      </w:r>
+      <w:r>
+        <w:t xml:space="preserve"> to deploy the </w:t>
+      </w:r>
+      <w:r>
+        <w:rPr>
+          <w:i/>
+          <w:iCs/>
+        </w:rPr>
+        <w:t>guestbook</w:t>
+      </w:r>
+      <w:r>
+        <w:t xml:space="preserve"> app’s resources (like Deployments, Services, etc.) — in this case, to the default namespace of your Kubernetes cluster.</w:t>
+      </w:r>
+    </w:p>
+    <w:p>
+      <w:pPr>
+        <w:numPr>
+          <w:ilvl w:val="0"/>
+          <w:numId w:val="3"/>
+        </w:numPr>
+      </w:pPr>
+      <w:r>
+        <w:t xml:space="preserve">However, </w:t>
+      </w:r>
+      <w:r>
+        <w:rPr>
+          <w:b/>
+          <w:bCs/>
+        </w:rPr>
+        <w:t>Argo CD itself</w:t>
+      </w:r>
+      <w:r>
+        <w:t xml:space="preserve"> stores and manages the Application custom resources in the </w:t>
+      </w:r>
+      <w:proofErr w:type="spellStart"/>
+      <w:r>
+        <w:t>argocd</w:t>
+      </w:r>
+      <w:proofErr w:type="spellEnd"/>
+      <w:r>
+        <w:t xml:space="preserve"> namespace by default. That’s why:</w:t>
+      </w:r>
+    </w:p>
+    <w:p>
+      <w:proofErr w:type="spellStart"/>
+      <w:r>
+        <w:t>kubectl</w:t>
+      </w:r>
+      <w:proofErr w:type="spellEnd"/>
+      <w:r>
+        <w:t xml:space="preserve"> get application -n </w:t>
+      </w:r>
+      <w:proofErr w:type="spellStart"/>
+      <w:r>
+        <w:t>argocd</w:t>
+      </w:r>
+      <w:proofErr w:type="spellEnd"/>
+    </w:p>
+    <w:p>
+      <w:r>
+        <w:t>shows the app, but querying the default namespace doesn’t — because the Application object wasn’t created there.</w:t>
+      </w:r>
+    </w:p>
+    <w:p>
+      <w:pPr>
+        <w:numPr>
+          <w:ilvl w:val="0"/>
+          <w:numId w:val="4"/>
+        </w:numPr>
+      </w:pPr>
+      <w:r>
+        <w:t>--</w:t>
+      </w:r>
+      <w:proofErr w:type="spellStart"/>
+      <w:r>
+        <w:t>dest</w:t>
+      </w:r>
+      <w:proofErr w:type="spellEnd"/>
+      <w:r>
+        <w:t xml:space="preserve">-namespace: where the app deploys </w:t>
+      </w:r>
+      <w:r>
+        <w:rPr>
+          <w:b/>
+          <w:bCs/>
+        </w:rPr>
+        <w:t>its</w:t>
+      </w:r>
+      <w:r>
+        <w:t xml:space="preserve"> resources.</w:t>
+      </w:r>
+    </w:p>
+    <w:p>
+      <w:pPr>
+        <w:numPr>
+          <w:ilvl w:val="0"/>
+          <w:numId w:val="4"/>
+        </w:numPr>
+      </w:pPr>
+      <w:r>
+        <w:t xml:space="preserve">-n </w:t>
+      </w:r>
+      <w:proofErr w:type="spellStart"/>
+      <w:r>
+        <w:t>argocd</w:t>
+      </w:r>
+      <w:proofErr w:type="spellEnd"/>
+      <w:r>
+        <w:t xml:space="preserve">: where </w:t>
+      </w:r>
+      <w:r>
+        <w:rPr>
+          <w:b/>
+          <w:bCs/>
+        </w:rPr>
+        <w:t>Argo CD's Application CRD</w:t>
+      </w:r>
+      <w:r>
+        <w:t xml:space="preserve"> lives.</w:t>
+      </w:r>
+    </w:p>
+    <w:p>
+      <w:bookmarkStart w:id="0" w:name="_GoBack"/>
+      <w:bookmarkEnd w:id="0"/>
     </w:p>
     <w:p/>
     <w:p/>
@@ -1892,11 +2276,315 @@
       </w:rPr>
     </w:lvl>
   </w:abstractNum>
+  <w:abstractNum w:abstractNumId="2" w15:restartNumberingAfterBreak="0">
+    <w:nsid w:val="4C8F55FE"/>
+    <w:multiLevelType w:val="multilevel"/>
+    <w:tmpl w:val="6B04F78E"/>
+    <w:lvl w:ilvl="0">
+      <w:start w:val="1"/>
+      <w:numFmt w:val="bullet"/>
+      <w:lvlText w:val=""/>
+      <w:lvlJc w:val="left"/>
+      <w:pPr>
+        <w:tabs>
+          <w:tab w:val="num" w:pos="720"/>
+        </w:tabs>
+        <w:ind w:left="720" w:hanging="360"/>
+      </w:pPr>
+      <w:rPr>
+        <w:rFonts w:ascii="Symbol" w:hAnsi="Symbol" w:hint="default"/>
+        <w:sz w:val="20"/>
+      </w:rPr>
+    </w:lvl>
+    <w:lvl w:ilvl="1" w:tentative="1">
+      <w:start w:val="1"/>
+      <w:numFmt w:val="bullet"/>
+      <w:lvlText w:val="o"/>
+      <w:lvlJc w:val="left"/>
+      <w:pPr>
+        <w:tabs>
+          <w:tab w:val="num" w:pos="1440"/>
+        </w:tabs>
+        <w:ind w:left="1440" w:hanging="360"/>
+      </w:pPr>
+      <w:rPr>
+        <w:rFonts w:ascii="Courier New" w:hAnsi="Courier New" w:hint="default"/>
+        <w:sz w:val="20"/>
+      </w:rPr>
+    </w:lvl>
+    <w:lvl w:ilvl="2" w:tentative="1">
+      <w:start w:val="1"/>
+      <w:numFmt w:val="bullet"/>
+      <w:lvlText w:val=""/>
+      <w:lvlJc w:val="left"/>
+      <w:pPr>
+        <w:tabs>
+          <w:tab w:val="num" w:pos="2160"/>
+        </w:tabs>
+        <w:ind w:left="2160" w:hanging="360"/>
+      </w:pPr>
+      <w:rPr>
+        <w:rFonts w:ascii="Wingdings" w:hAnsi="Wingdings" w:hint="default"/>
+        <w:sz w:val="20"/>
+      </w:rPr>
+    </w:lvl>
+    <w:lvl w:ilvl="3" w:tentative="1">
+      <w:start w:val="1"/>
+      <w:numFmt w:val="bullet"/>
+      <w:lvlText w:val=""/>
+      <w:lvlJc w:val="left"/>
+      <w:pPr>
+        <w:tabs>
+          <w:tab w:val="num" w:pos="2880"/>
+        </w:tabs>
+        <w:ind w:left="2880" w:hanging="360"/>
+      </w:pPr>
+      <w:rPr>
+        <w:rFonts w:ascii="Wingdings" w:hAnsi="Wingdings" w:hint="default"/>
+        <w:sz w:val="20"/>
+      </w:rPr>
+    </w:lvl>
+    <w:lvl w:ilvl="4" w:tentative="1">
+      <w:start w:val="1"/>
+      <w:numFmt w:val="bullet"/>
+      <w:lvlText w:val=""/>
+      <w:lvlJc w:val="left"/>
+      <w:pPr>
+        <w:tabs>
+          <w:tab w:val="num" w:pos="3600"/>
+        </w:tabs>
+        <w:ind w:left="3600" w:hanging="360"/>
+      </w:pPr>
+      <w:rPr>
+        <w:rFonts w:ascii="Wingdings" w:hAnsi="Wingdings" w:hint="default"/>
+        <w:sz w:val="20"/>
+      </w:rPr>
+    </w:lvl>
+    <w:lvl w:ilvl="5" w:tentative="1">
+      <w:start w:val="1"/>
+      <w:numFmt w:val="bullet"/>
+      <w:lvlText w:val=""/>
+      <w:lvlJc w:val="left"/>
+      <w:pPr>
+        <w:tabs>
+          <w:tab w:val="num" w:pos="4320"/>
+        </w:tabs>
+        <w:ind w:left="4320" w:hanging="360"/>
+      </w:pPr>
+      <w:rPr>
+        <w:rFonts w:ascii="Wingdings" w:hAnsi="Wingdings" w:hint="default"/>
+        <w:sz w:val="20"/>
+      </w:rPr>
+    </w:lvl>
+    <w:lvl w:ilvl="6" w:tentative="1">
+      <w:start w:val="1"/>
+      <w:numFmt w:val="bullet"/>
+      <w:lvlText w:val=""/>
+      <w:lvlJc w:val="left"/>
+      <w:pPr>
+        <w:tabs>
+          <w:tab w:val="num" w:pos="5040"/>
+        </w:tabs>
+        <w:ind w:left="5040" w:hanging="360"/>
+      </w:pPr>
+      <w:rPr>
+        <w:rFonts w:ascii="Wingdings" w:hAnsi="Wingdings" w:hint="default"/>
+        <w:sz w:val="20"/>
+      </w:rPr>
+    </w:lvl>
+    <w:lvl w:ilvl="7" w:tentative="1">
+      <w:start w:val="1"/>
+      <w:numFmt w:val="bullet"/>
+      <w:lvlText w:val=""/>
+      <w:lvlJc w:val="left"/>
+      <w:pPr>
+        <w:tabs>
+          <w:tab w:val="num" w:pos="5760"/>
+        </w:tabs>
+        <w:ind w:left="5760" w:hanging="360"/>
+      </w:pPr>
+      <w:rPr>
+        <w:rFonts w:ascii="Wingdings" w:hAnsi="Wingdings" w:hint="default"/>
+        <w:sz w:val="20"/>
+      </w:rPr>
+    </w:lvl>
+    <w:lvl w:ilvl="8" w:tentative="1">
+      <w:start w:val="1"/>
+      <w:numFmt w:val="bullet"/>
+      <w:lvlText w:val=""/>
+      <w:lvlJc w:val="left"/>
+      <w:pPr>
+        <w:tabs>
+          <w:tab w:val="num" w:pos="6480"/>
+        </w:tabs>
+        <w:ind w:left="6480" w:hanging="360"/>
+      </w:pPr>
+      <w:rPr>
+        <w:rFonts w:ascii="Wingdings" w:hAnsi="Wingdings" w:hint="default"/>
+        <w:sz w:val="20"/>
+      </w:rPr>
+    </w:lvl>
+  </w:abstractNum>
+  <w:abstractNum w:abstractNumId="3" w15:restartNumberingAfterBreak="0">
+    <w:nsid w:val="52A72274"/>
+    <w:multiLevelType w:val="multilevel"/>
+    <w:tmpl w:val="0428C83A"/>
+    <w:lvl w:ilvl="0">
+      <w:start w:val="1"/>
+      <w:numFmt w:val="bullet"/>
+      <w:lvlText w:val=""/>
+      <w:lvlJc w:val="left"/>
+      <w:pPr>
+        <w:tabs>
+          <w:tab w:val="num" w:pos="720"/>
+        </w:tabs>
+        <w:ind w:left="720" w:hanging="360"/>
+      </w:pPr>
+      <w:rPr>
+        <w:rFonts w:ascii="Symbol" w:hAnsi="Symbol" w:hint="default"/>
+        <w:sz w:val="20"/>
+      </w:rPr>
+    </w:lvl>
+    <w:lvl w:ilvl="1" w:tentative="1">
+      <w:start w:val="1"/>
+      <w:numFmt w:val="bullet"/>
+      <w:lvlText w:val="o"/>
+      <w:lvlJc w:val="left"/>
+      <w:pPr>
+        <w:tabs>
+          <w:tab w:val="num" w:pos="1440"/>
+        </w:tabs>
+        <w:ind w:left="1440" w:hanging="360"/>
+      </w:pPr>
+      <w:rPr>
+        <w:rFonts w:ascii="Courier New" w:hAnsi="Courier New" w:hint="default"/>
+        <w:sz w:val="20"/>
+      </w:rPr>
+    </w:lvl>
+    <w:lvl w:ilvl="2" w:tentative="1">
+      <w:start w:val="1"/>
+      <w:numFmt w:val="bullet"/>
+      <w:lvlText w:val=""/>
+      <w:lvlJc w:val="left"/>
+      <w:pPr>
+        <w:tabs>
+          <w:tab w:val="num" w:pos="2160"/>
+        </w:tabs>
+        <w:ind w:left="2160" w:hanging="360"/>
+      </w:pPr>
+      <w:rPr>
+        <w:rFonts w:ascii="Wingdings" w:hAnsi="Wingdings" w:hint="default"/>
+        <w:sz w:val="20"/>
+      </w:rPr>
+    </w:lvl>
+    <w:lvl w:ilvl="3" w:tentative="1">
+      <w:start w:val="1"/>
+      <w:numFmt w:val="bullet"/>
+      <w:lvlText w:val=""/>
+      <w:lvlJc w:val="left"/>
+      <w:pPr>
+        <w:tabs>
+          <w:tab w:val="num" w:pos="2880"/>
+        </w:tabs>
+        <w:ind w:left="2880" w:hanging="360"/>
+      </w:pPr>
+      <w:rPr>
+        <w:rFonts w:ascii="Wingdings" w:hAnsi="Wingdings" w:hint="default"/>
+        <w:sz w:val="20"/>
+      </w:rPr>
+    </w:lvl>
+    <w:lvl w:ilvl="4" w:tentative="1">
+      <w:start w:val="1"/>
+      <w:numFmt w:val="bullet"/>
+      <w:lvlText w:val=""/>
+      <w:lvlJc w:val="left"/>
+      <w:pPr>
+        <w:tabs>
+          <w:tab w:val="num" w:pos="3600"/>
+        </w:tabs>
+        <w:ind w:left="3600" w:hanging="360"/>
+      </w:pPr>
+      <w:rPr>
+        <w:rFonts w:ascii="Wingdings" w:hAnsi="Wingdings" w:hint="default"/>
+        <w:sz w:val="20"/>
+      </w:rPr>
+    </w:lvl>
+    <w:lvl w:ilvl="5" w:tentative="1">
+      <w:start w:val="1"/>
+      <w:numFmt w:val="bullet"/>
+      <w:lvlText w:val=""/>
+      <w:lvlJc w:val="left"/>
+      <w:pPr>
+        <w:tabs>
+          <w:tab w:val="num" w:pos="4320"/>
+        </w:tabs>
+        <w:ind w:left="4320" w:hanging="360"/>
+      </w:pPr>
+      <w:rPr>
+        <w:rFonts w:ascii="Wingdings" w:hAnsi="Wingdings" w:hint="default"/>
+        <w:sz w:val="20"/>
+      </w:rPr>
+    </w:lvl>
+    <w:lvl w:ilvl="6" w:tentative="1">
+      <w:start w:val="1"/>
+      <w:numFmt w:val="bullet"/>
+      <w:lvlText w:val=""/>
+      <w:lvlJc w:val="left"/>
+      <w:pPr>
+        <w:tabs>
+          <w:tab w:val="num" w:pos="5040"/>
+        </w:tabs>
+        <w:ind w:left="5040" w:hanging="360"/>
+      </w:pPr>
+      <w:rPr>
+        <w:rFonts w:ascii="Wingdings" w:hAnsi="Wingdings" w:hint="default"/>
+        <w:sz w:val="20"/>
+      </w:rPr>
+    </w:lvl>
+    <w:lvl w:ilvl="7" w:tentative="1">
+      <w:start w:val="1"/>
+      <w:numFmt w:val="bullet"/>
+      <w:lvlText w:val=""/>
+      <w:lvlJc w:val="left"/>
+      <w:pPr>
+        <w:tabs>
+          <w:tab w:val="num" w:pos="5760"/>
+        </w:tabs>
+        <w:ind w:left="5760" w:hanging="360"/>
+      </w:pPr>
+      <w:rPr>
+        <w:rFonts w:ascii="Wingdings" w:hAnsi="Wingdings" w:hint="default"/>
+        <w:sz w:val="20"/>
+      </w:rPr>
+    </w:lvl>
+    <w:lvl w:ilvl="8" w:tentative="1">
+      <w:start w:val="1"/>
+      <w:numFmt w:val="bullet"/>
+      <w:lvlText w:val=""/>
+      <w:lvlJc w:val="left"/>
+      <w:pPr>
+        <w:tabs>
+          <w:tab w:val="num" w:pos="6480"/>
+        </w:tabs>
+        <w:ind w:left="6480" w:hanging="360"/>
+      </w:pPr>
+      <w:rPr>
+        <w:rFonts w:ascii="Wingdings" w:hAnsi="Wingdings" w:hint="default"/>
+        <w:sz w:val="20"/>
+      </w:rPr>
+    </w:lvl>
+  </w:abstractNum>
   <w:num w:numId="1">
     <w:abstractNumId w:val="1"/>
   </w:num>
   <w:num w:numId="2">
     <w:abstractNumId w:val="0"/>
+  </w:num>
+  <w:num w:numId="3">
+    <w:abstractNumId w:val="2"/>
+  </w:num>
+  <w:num w:numId="4">
+    <w:abstractNumId w:val="3"/>
   </w:num>
 </w:numbering>
 </file>
@@ -2302,7 +2990,6 @@
   <w:style w:type="character" w:default="1" w:styleId="DefaultParagraphFont">
     <w:name w:val="Default Paragraph Font"/>
     <w:uiPriority w:val="1"/>
-    <w:semiHidden/>
     <w:unhideWhenUsed/>
   </w:style>
   <w:style w:type="table" w:default="1" w:styleId="TableNormal">
@@ -2359,6 +3046,18 @@
       <w:ind w:left="720"/>
       <w:contextualSpacing/>
     </w:pPr>
+  </w:style>
+  <w:style w:type="character" w:styleId="FollowedHyperlink">
+    <w:name w:val="FollowedHyperlink"/>
+    <w:basedOn w:val="DefaultParagraphFont"/>
+    <w:uiPriority w:val="99"/>
+    <w:semiHidden/>
+    <w:unhideWhenUsed/>
+    <w:rsid w:val="004701AD"/>
+    <w:rPr>
+      <w:color w:val="954F72" w:themeColor="followedHyperlink"/>
+      <w:u w:val="single"/>
+    </w:rPr>
   </w:style>
 </w:styles>
 </file>

</xml_diff>